<commit_message>
Images to larger resolution new SJ-6
</commit_message>
<xml_diff>
--- a/JetLagPro_Research_Paper.docx
+++ b/JetLagPro_Research_Paper.docx
@@ -1,6 +1,6 @@
 
 <file path=word/document.xml><?xml version="1.0" encoding="utf-8"?>
-<w:document xmlns:wpc="http://schemas.microsoft.com/office/word/2010/wordprocessingCanvas" xmlns:cx="http://schemas.microsoft.com/office/drawing/2014/chartex" xmlns:cx1="http://schemas.microsoft.com/office/drawing/2015/9/8/chartex" xmlns:cx2="http://schemas.microsoft.com/office/drawing/2015/10/21/chartex" xmlns:cx3="http://schemas.microsoft.com/office/drawing/2016/5/9/chartex" xmlns:cx4="http://schemas.microsoft.com/office/drawing/2016/5/10/chartex" xmlns:cx5="http://schemas.microsoft.com/office/drawing/2016/5/11/chartex" xmlns:cx6="http://schemas.microsoft.com/office/drawing/2016/5/12/chartex" xmlns:cx7="http://schemas.microsoft.com/office/drawing/2016/5/13/chartex" xmlns:cx8="http://schemas.microsoft.com/office/drawing/2016/5/14/chartex" xmlns:mc="http://schemas.openxmlformats.org/markup-compatibility/2006" xmlns:aink="http://schemas.microsoft.com/office/drawing/2016/ink" xmlns:am3d="http://schemas.microsoft.com/office/drawing/2017/model3d" xmlns:o="urn:schemas-microsoft-com:office:office" xmlns:r="http://schemas.openxmlformats.org/officeDocument/2006/relationships" xmlns:m="http://schemas.openxmlformats.org/officeDocument/2006/math" xmlns:v="urn:schemas-microsoft-com:vml" xmlns:wp14="http://schemas.microsoft.com/office/word/2010/wordprocessingDrawing" xmlns:wp="http://schemas.openxmlformats.org/drawingml/2006/wordprocessingDrawing" xmlns:w10="urn:schemas-microsoft-com:office:word" xmlns:w="http://schemas.openxmlformats.org/wordprocessingml/2006/main" xmlns:w14="http://schemas.microsoft.com/office/word/2010/wordml" xmlns:w15="http://schemas.microsoft.com/office/word/2012/wordml" xmlns:w16cid="http://schemas.microsoft.com/office/word/2016/wordml/cid" xmlns:w16se="http://schemas.microsoft.com/office/word/2015/wordml/symex" xmlns:wpg="http://schemas.microsoft.com/office/word/2010/wordprocessingGroup" xmlns:wpi="http://schemas.microsoft.com/office/word/2010/wordprocessingInk" xmlns:wne="http://schemas.microsoft.com/office/word/2006/wordml" xmlns:wps="http://schemas.microsoft.com/office/word/2010/wordprocessingShape" mc:Ignorable="w14 w15 w16se w16cid wp14">
+<w:document xmlns:wpc="http://schemas.microsoft.com/office/word/2010/wordprocessingCanvas" xmlns:cx="http://schemas.microsoft.com/office/drawing/2014/chartex" xmlns:cx1="http://schemas.microsoft.com/office/drawing/2015/9/8/chartex" xmlns:cx2="http://schemas.microsoft.com/office/drawing/2015/10/21/chartex" xmlns:cx3="http://schemas.microsoft.com/office/drawing/2016/5/9/chartex" xmlns:cx4="http://schemas.microsoft.com/office/drawing/2016/5/10/chartex" xmlns:cx5="http://schemas.microsoft.com/office/drawing/2016/5/11/chartex" xmlns:cx6="http://schemas.microsoft.com/office/drawing/2016/5/12/chartex" xmlns:cx7="http://schemas.microsoft.com/office/drawing/2016/5/13/chartex" xmlns:cx8="http://schemas.microsoft.com/office/drawing/2016/5/14/chartex" xmlns:mc="http://schemas.openxmlformats.org/markup-compatibility/2006" xmlns:aink="http://schemas.microsoft.com/office/drawing/2016/ink" xmlns:am3d="http://schemas.microsoft.com/office/drawing/2017/model3d" xmlns:o="urn:schemas-microsoft-com:office:office" xmlns:r="http://schemas.openxmlformats.org/officeDocument/2006/relationships" xmlns:m="http://schemas.openxmlformats.org/officeDocument/2006/math" xmlns:v="urn:schemas-microsoft-com:vml" xmlns:wp14="http://schemas.microsoft.com/office/word/2010/wordprocessingDrawing" xmlns:wp="http://schemas.openxmlformats.org/drawingml/2006/wordprocessingDrawing" xmlns:w10="urn:schemas-microsoft-com:office:word" xmlns:w="http://schemas.openxmlformats.org/wordprocessingml/2006/main" xmlns:w14="http://schemas.microsoft.com/office/word/2010/wordml" xmlns:w15="http://schemas.microsoft.com/office/word/2012/wordml" xmlns:w16cex="http://schemas.microsoft.com/office/word/2018/wordml/cex" xmlns:w16cid="http://schemas.microsoft.com/office/word/2016/wordml/cid" xmlns:w16="http://schemas.microsoft.com/office/word/2018/wordml" xmlns:w16se="http://schemas.microsoft.com/office/word/2015/wordml/symex" xmlns:wpg="http://schemas.microsoft.com/office/word/2010/wordprocessingGroup" xmlns:wpi="http://schemas.microsoft.com/office/word/2010/wordprocessingInk" xmlns:wne="http://schemas.microsoft.com/office/word/2006/wordml" xmlns:wps="http://schemas.microsoft.com/office/word/2010/wordprocessingShape" mc:Ignorable="w14 w15 w16se w16cid w16 w16cex wp14">
   <w:body>
     <w:p>
       <w:pPr>
@@ -434,10 +434,10 @@
         </w:rPr>
         <w:lastRenderedPageBreak/>
         <w:drawing>
-          <wp:inline distT="0" distB="0" distL="0" distR="0" wp14:anchorId="1EFA33C0" wp14:editId="3C26F07D">
-            <wp:extent cx="2828925" cy="2828925"/>
+          <wp:inline distT="0" distB="0" distL="0" distR="0" wp14:anchorId="4B27F818" wp14:editId="0213E518">
+            <wp:extent cx="3629025" cy="3629025"/>
             <wp:effectExtent l="0" t="0" r="9525" b="9525"/>
-            <wp:docPr id="7" name="Picture 7"/>
+            <wp:docPr id="1" name="Picture 1"/>
             <wp:cNvGraphicFramePr>
               <a:graphicFrameLocks xmlns:a="http://schemas.openxmlformats.org/drawingml/2006/main" noChangeAspect="1"/>
             </wp:cNvGraphicFramePr>
@@ -445,11 +445,11 @@
               <a:graphicData uri="http://schemas.openxmlformats.org/drawingml/2006/picture">
                 <pic:pic xmlns:pic="http://schemas.openxmlformats.org/drawingml/2006/picture">
                   <pic:nvPicPr>
-                    <pic:cNvPr id="7" name="Wheel-Minimal.jpg"/>
+                    <pic:cNvPr id="1" name="Picture 1"/>
                     <pic:cNvPicPr/>
                   </pic:nvPicPr>
                   <pic:blipFill>
-                    <a:blip r:embed="rId6">
+                    <a:blip r:embed="rId6" cstate="print">
                       <a:extLst>
                         <a:ext uri="{28A0092B-C50C-407E-A947-70E740481C1C}">
                           <a14:useLocalDpi xmlns:a14="http://schemas.microsoft.com/office/drawing/2010/main" val="0"/>
@@ -463,7 +463,7 @@
                   <pic:spPr>
                     <a:xfrm>
                       <a:off x="0" y="0"/>
-                      <a:ext cx="2828925" cy="2828925"/>
+                      <a:ext cx="3629025" cy="3629025"/>
                     </a:xfrm>
                     <a:prstGeom prst="rect">
                       <a:avLst/>
@@ -2492,7 +2492,15 @@
           <w:b w:val="0"/>
           <w:bCs w:val="0"/>
         </w:rPr>
-        <w:t xml:space="preserve">Our solution was to use alternative channel points to replace “inaccessible” points understanding that </w:t>
+        <w:t xml:space="preserve">Our solution was to use alternative channel points to replace “inaccessible” points </w:t>
+      </w:r>
+      <w:r>
+        <w:rPr>
+          <w:b w:val="0"/>
+          <w:bCs w:val="0"/>
+        </w:rPr>
+        <w:lastRenderedPageBreak/>
+        <w:t xml:space="preserve">understanding that </w:t>
       </w:r>
       <w:r>
         <w:rPr>
@@ -2608,15 +2616,7 @@
           <w:b w:val="0"/>
           <w:bCs w:val="0"/>
         </w:rPr>
-        <w:t xml:space="preserve">SP-10 (above the knee) for SP-3, BL-2 (inner eyebrow) for BL-66, GB-20 (back of head) for GB-41, LIV-8 (medial knee) for LIV-1, </w:t>
-      </w:r>
-      <w:r>
-        <w:rPr>
-          <w:b w:val="0"/>
-          <w:bCs w:val="0"/>
-        </w:rPr>
-        <w:lastRenderedPageBreak/>
-        <w:t>and KI-27 (upper chest) for KI-10. In TCM theory, any point on a meridian can affect the entire pathway and this substitution maintains meridian specificity.</w:t>
+        <w:t>SP-10 (above the knee) for SP-3, BL-2 (inner eyebrow) for BL-66, GB-20 (back of head) for GB-41, LIV-8 (medial knee) for LIV-1, and KI-27 (upper chest) for KI-10. In TCM theory, any point on a meridian can affect the entire pathway and this substitution maintains meridian specificity.</w:t>
       </w:r>
     </w:p>
     <w:p>
@@ -2762,21 +2762,13 @@
         <w:t xml:space="preserve">Once you have the app installed, follow the simple directions </w:t>
       </w:r>
       <w:r>
-        <w:t xml:space="preserve">to </w:t>
-      </w:r>
-      <w:bookmarkStart w:id="0" w:name="_GoBack"/>
-      <w:r>
-        <w:t>receive</w:t>
+        <w:t>to receive</w:t>
       </w:r>
       <w:r>
         <w:t xml:space="preserve"> timing and instructions. </w:t>
       </w:r>
       <w:r>
-        <w:t xml:space="preserve">If you have questions, email </w:t>
-      </w:r>
-      <w:bookmarkEnd w:id="0"/>
-      <w:r>
-        <w:t>info@jetlagpro.com.</w:t>
+        <w:t>If you have questions, email info@jetlagpro.com.</w:t>
       </w:r>
     </w:p>
     <w:p>
@@ -2815,13 +2807,15 @@
             </w:pPr>
             <w:r>
               <w:rPr>
+                <w:rFonts w:eastAsia="Times New Roman"/>
                 <w:noProof/>
+                <w:color w:val="333333"/>
               </w:rPr>
               <w:drawing>
-                <wp:inline distT="0" distB="0" distL="0" distR="0" wp14:anchorId="7D9109C6" wp14:editId="26DF400D">
-                  <wp:extent cx="1677945" cy="3648075"/>
+                <wp:inline distT="0" distB="0" distL="0" distR="0" wp14:anchorId="698CDE87" wp14:editId="615F5AE5">
+                  <wp:extent cx="1685779" cy="3648075"/>
                   <wp:effectExtent l="0" t="0" r="0" b="0"/>
-                  <wp:docPr id="4" name="Picture 4"/>
+                  <wp:docPr id="14" name="Picture 14"/>
                   <wp:cNvGraphicFramePr>
                     <a:graphicFrameLocks xmlns:a="http://schemas.openxmlformats.org/drawingml/2006/main" noChangeAspect="1"/>
                   </wp:cNvGraphicFramePr>
@@ -2829,10 +2823,8 @@
                     <a:graphicData uri="http://schemas.openxmlformats.org/drawingml/2006/picture">
                       <pic:pic xmlns:pic="http://schemas.openxmlformats.org/drawingml/2006/picture">
                         <pic:nvPicPr>
-                          <pic:cNvPr id="0" name="Picture 1"/>
-                          <pic:cNvPicPr>
-                            <a:picLocks noChangeAspect="1" noChangeArrowheads="1"/>
-                          </pic:cNvPicPr>
+                          <pic:cNvPr id="14" name="Picture 14"/>
+                          <pic:cNvPicPr/>
                         </pic:nvPicPr>
                         <pic:blipFill>
                           <a:blip r:embed="rId9" cstate="print">
@@ -2842,23 +2834,18 @@
                               </a:ext>
                             </a:extLst>
                           </a:blip>
-                          <a:srcRect/>
                           <a:stretch>
                             <a:fillRect/>
                           </a:stretch>
                         </pic:blipFill>
-                        <pic:spPr bwMode="auto">
+                        <pic:spPr>
                           <a:xfrm>
                             <a:off x="0" y="0"/>
-                            <a:ext cx="1692565" cy="3679862"/>
+                            <a:ext cx="1692160" cy="3661883"/>
                           </a:xfrm>
                           <a:prstGeom prst="rect">
                             <a:avLst/>
                           </a:prstGeom>
-                          <a:noFill/>
-                          <a:ln>
-                            <a:noFill/>
-                          </a:ln>
                         </pic:spPr>
                       </pic:pic>
                     </a:graphicData>
@@ -2882,13 +2869,15 @@
             </w:pPr>
             <w:r>
               <w:rPr>
+                <w:rFonts w:eastAsia="Times New Roman"/>
                 <w:noProof/>
+                <w:color w:val="333333"/>
               </w:rPr>
               <w:drawing>
-                <wp:inline distT="0" distB="0" distL="0" distR="0" wp14:anchorId="3898CF7B" wp14:editId="6CC2E585">
-                  <wp:extent cx="1688399" cy="3648075"/>
-                  <wp:effectExtent l="0" t="0" r="7620" b="0"/>
-                  <wp:docPr id="11" name="Picture 11"/>
+                <wp:inline distT="0" distB="0" distL="0" distR="0" wp14:anchorId="519031A9" wp14:editId="26F5FDA5">
+                  <wp:extent cx="1685779" cy="3648075"/>
+                  <wp:effectExtent l="0" t="0" r="0" b="0"/>
+                  <wp:docPr id="13" name="Picture 13"/>
                   <wp:cNvGraphicFramePr>
                     <a:graphicFrameLocks xmlns:a="http://schemas.openxmlformats.org/drawingml/2006/main" noChangeAspect="1"/>
                   </wp:cNvGraphicFramePr>
@@ -2896,10 +2885,8 @@
                     <a:graphicData uri="http://schemas.openxmlformats.org/drawingml/2006/picture">
                       <pic:pic xmlns:pic="http://schemas.openxmlformats.org/drawingml/2006/picture">
                         <pic:nvPicPr>
-                          <pic:cNvPr id="0" name="Picture 2"/>
-                          <pic:cNvPicPr>
-                            <a:picLocks noChangeAspect="1" noChangeArrowheads="1"/>
-                          </pic:cNvPicPr>
+                          <pic:cNvPr id="13" name="Picture 13"/>
+                          <pic:cNvPicPr/>
                         </pic:nvPicPr>
                         <pic:blipFill>
                           <a:blip r:embed="rId10" cstate="print">
@@ -2909,23 +2896,18 @@
                               </a:ext>
                             </a:extLst>
                           </a:blip>
-                          <a:srcRect/>
                           <a:stretch>
                             <a:fillRect/>
                           </a:stretch>
                         </pic:blipFill>
-                        <pic:spPr bwMode="auto">
+                        <pic:spPr>
                           <a:xfrm>
                             <a:off x="0" y="0"/>
-                            <a:ext cx="1703712" cy="3681162"/>
+                            <a:ext cx="1694765" cy="3667520"/>
                           </a:xfrm>
                           <a:prstGeom prst="rect">
                             <a:avLst/>
                           </a:prstGeom>
-                          <a:noFill/>
-                          <a:ln>
-                            <a:noFill/>
-                          </a:ln>
                         </pic:spPr>
                       </pic:pic>
                     </a:graphicData>
@@ -2949,13 +2931,15 @@
             </w:pPr>
             <w:r>
               <w:rPr>
+                <w:rFonts w:eastAsia="Times New Roman"/>
                 <w:noProof/>
+                <w:color w:val="333333"/>
               </w:rPr>
               <w:drawing>
-                <wp:inline distT="0" distB="0" distL="0" distR="0" wp14:anchorId="67182FF7" wp14:editId="1DA5C933">
-                  <wp:extent cx="1695450" cy="3663310"/>
+                <wp:inline distT="0" distB="0" distL="0" distR="0" wp14:anchorId="77C74EAA" wp14:editId="4D5D1732">
+                  <wp:extent cx="1685780" cy="3648075"/>
                   <wp:effectExtent l="0" t="0" r="0" b="0"/>
-                  <wp:docPr id="12" name="Picture 12"/>
+                  <wp:docPr id="9" name="Picture 9"/>
                   <wp:cNvGraphicFramePr>
                     <a:graphicFrameLocks xmlns:a="http://schemas.openxmlformats.org/drawingml/2006/main" noChangeAspect="1"/>
                   </wp:cNvGraphicFramePr>
@@ -2963,10 +2947,8 @@
                     <a:graphicData uri="http://schemas.openxmlformats.org/drawingml/2006/picture">
                       <pic:pic xmlns:pic="http://schemas.openxmlformats.org/drawingml/2006/picture">
                         <pic:nvPicPr>
-                          <pic:cNvPr id="0" name="Picture 3"/>
-                          <pic:cNvPicPr>
-                            <a:picLocks noChangeAspect="1" noChangeArrowheads="1"/>
-                          </pic:cNvPicPr>
+                          <pic:cNvPr id="9" name="Picture 9"/>
+                          <pic:cNvPicPr/>
                         </pic:nvPicPr>
                         <pic:blipFill>
                           <a:blip r:embed="rId11" cstate="print">
@@ -2976,23 +2958,18 @@
                               </a:ext>
                             </a:extLst>
                           </a:blip>
-                          <a:srcRect/>
                           <a:stretch>
                             <a:fillRect/>
                           </a:stretch>
                         </pic:blipFill>
-                        <pic:spPr bwMode="auto">
+                        <pic:spPr>
                           <a:xfrm>
                             <a:off x="0" y="0"/>
-                            <a:ext cx="1703225" cy="3680109"/>
+                            <a:ext cx="1700227" cy="3679339"/>
                           </a:xfrm>
                           <a:prstGeom prst="rect">
                             <a:avLst/>
                           </a:prstGeom>
-                          <a:noFill/>
-                          <a:ln>
-                            <a:noFill/>
-                          </a:ln>
                         </pic:spPr>
                       </pic:pic>
                     </a:graphicData>
@@ -3063,1094 +3040,91 @@
         <w:t>iW</w:t>
       </w:r>
       <w:r>
-        <w:t xml:space="preserve">atch) until clicked. When clicked, the </w:t>
+        <w:t xml:space="preserve">atch) until clicked. When </w:t>
+      </w:r>
+      <w:r>
+        <w:lastRenderedPageBreak/>
+        <w:t xml:space="preserve">clicked, the </w:t>
       </w:r>
       <w:r>
         <w:t>traveler</w:t>
       </w:r>
       <w:r>
-        <w:t xml:space="preserve"> is shown the correct image beside a looping video showing how to stimulate the point.</w:t>
+        <w:t xml:space="preserve"> is shown the correct </w:t>
+      </w:r>
+      <w:r>
+        <w:t xml:space="preserve">point </w:t>
+      </w:r>
+      <w:r>
+        <w:t>image beside a looping video showing how to stimulate the point.</w:t>
       </w:r>
     </w:p>
     <w:p>
       <w:pPr>
-        <w:pStyle w:val="Heading2"/>
-        <w:spacing w:after="150"/>
+        <w:divId w:val="1808039875"/>
+      </w:pPr>
+    </w:p>
+    <w:p>
+      <w:pPr>
         <w:jc w:val="center"/>
-        <w:rPr>
-          <w:rFonts w:eastAsia="Times New Roman"/>
-        </w:rPr>
-      </w:pPr>
-      <w:r>
-        <w:rPr>
-          <w:rFonts w:eastAsia="Times New Roman"/>
-        </w:rPr>
-        <w:lastRenderedPageBreak/>
-        <w:t>Point Images</w:t>
+        <w:divId w:val="1808039875"/>
+      </w:pPr>
+      <w:r>
+        <w:rPr>
+          <w:noProof/>
+        </w:rPr>
+        <w:drawing>
+          <wp:inline distT="0" distB="0" distL="0" distR="0" wp14:anchorId="3E2252DA" wp14:editId="0855ABE5">
+            <wp:extent cx="5724525" cy="2233543"/>
+            <wp:effectExtent l="0" t="0" r="0" b="0"/>
+            <wp:docPr id="31" name="Picture 31"/>
+            <wp:cNvGraphicFramePr>
+              <a:graphicFrameLocks xmlns:a="http://schemas.openxmlformats.org/drawingml/2006/main" noChangeAspect="1"/>
+            </wp:cNvGraphicFramePr>
+            <a:graphic xmlns:a="http://schemas.openxmlformats.org/drawingml/2006/main">
+              <a:graphicData uri="http://schemas.openxmlformats.org/drawingml/2006/picture">
+                <pic:pic xmlns:pic="http://schemas.openxmlformats.org/drawingml/2006/picture">
+                  <pic:nvPicPr>
+                    <pic:cNvPr id="31" name="Picture 31"/>
+                    <pic:cNvPicPr/>
+                  </pic:nvPicPr>
+                  <pic:blipFill>
+                    <a:blip r:embed="rId12" cstate="print">
+                      <a:extLst>
+                        <a:ext uri="{28A0092B-C50C-407E-A947-70E740481C1C}">
+                          <a14:useLocalDpi xmlns:a14="http://schemas.microsoft.com/office/drawing/2010/main" val="0"/>
+                        </a:ext>
+                      </a:extLst>
+                    </a:blip>
+                    <a:stretch>
+                      <a:fillRect/>
+                    </a:stretch>
+                  </pic:blipFill>
+                  <pic:spPr>
+                    <a:xfrm>
+                      <a:off x="0" y="0"/>
+                      <a:ext cx="5734740" cy="2237528"/>
+                    </a:xfrm>
+                    <a:prstGeom prst="rect">
+                      <a:avLst/>
+                    </a:prstGeom>
+                  </pic:spPr>
+                </pic:pic>
+              </a:graphicData>
+            </a:graphic>
+          </wp:inline>
+        </w:drawing>
       </w:r>
     </w:p>
-    <w:tbl>
-      <w:tblPr>
-        <w:tblStyle w:val="TableGrid"/>
-        <w:tblW w:w="0" w:type="auto"/>
-        <w:tblBorders>
-          <w:top w:val="none" w:sz="0" w:space="0" w:color="auto"/>
-          <w:left w:val="none" w:sz="0" w:space="0" w:color="auto"/>
-          <w:bottom w:val="none" w:sz="0" w:space="0" w:color="auto"/>
-          <w:right w:val="none" w:sz="0" w:space="0" w:color="auto"/>
-          <w:insideH w:val="none" w:sz="0" w:space="0" w:color="auto"/>
-          <w:insideV w:val="none" w:sz="0" w:space="0" w:color="auto"/>
-        </w:tblBorders>
-        <w:tblLook w:val="04A0" w:firstRow="1" w:lastRow="0" w:firstColumn="1" w:lastColumn="0" w:noHBand="0" w:noVBand="1"/>
-      </w:tblPr>
-      <w:tblGrid>
-        <w:gridCol w:w="1453"/>
-        <w:gridCol w:w="1600"/>
-        <w:gridCol w:w="1748"/>
-        <w:gridCol w:w="1611"/>
-        <w:gridCol w:w="1466"/>
-        <w:gridCol w:w="1482"/>
-      </w:tblGrid>
-      <w:tr>
-        <w:tc>
-          <w:tcPr>
-            <w:tcW w:w="1558" w:type="dxa"/>
-          </w:tcPr>
-          <w:p>
-            <w:pPr>
-              <w:pStyle w:val="Heading2"/>
-              <w:spacing w:after="150"/>
-              <w:jc w:val="center"/>
-              <w:rPr>
-                <w:rFonts w:eastAsia="Times New Roman"/>
-              </w:rPr>
-            </w:pPr>
-            <w:r>
-              <w:rPr>
-                <w:rFonts w:eastAsia="Times New Roman"/>
-                <w:noProof/>
-              </w:rPr>
-              <w:drawing>
-                <wp:inline distT="0" distB="0" distL="0" distR="0" wp14:anchorId="0A97E76D" wp14:editId="381F5226">
-                  <wp:extent cx="799765" cy="876528"/>
-                  <wp:effectExtent l="0" t="0" r="635" b="0"/>
-                  <wp:docPr id="6" name="Picture 6"/>
-                  <wp:cNvGraphicFramePr>
-                    <a:graphicFrameLocks xmlns:a="http://schemas.openxmlformats.org/drawingml/2006/main" noChangeAspect="1"/>
-                  </wp:cNvGraphicFramePr>
-                  <a:graphic xmlns:a="http://schemas.openxmlformats.org/drawingml/2006/main">
-                    <a:graphicData uri="http://schemas.openxmlformats.org/drawingml/2006/picture">
-                      <pic:pic xmlns:pic="http://schemas.openxmlformats.org/drawingml/2006/picture">
-                        <pic:nvPicPr>
-                          <pic:cNvPr id="0" name="Picture 2"/>
-                          <pic:cNvPicPr>
-                            <a:picLocks noChangeAspect="1" noChangeArrowheads="1"/>
-                          </pic:cNvPicPr>
-                        </pic:nvPicPr>
-                        <pic:blipFill>
-                          <a:blip r:embed="rId12" cstate="print">
-                            <a:extLst>
-                              <a:ext uri="{28A0092B-C50C-407E-A947-70E740481C1C}">
-                                <a14:useLocalDpi xmlns:a14="http://schemas.microsoft.com/office/drawing/2010/main" val="0"/>
-                              </a:ext>
-                            </a:extLst>
-                          </a:blip>
-                          <a:srcRect/>
-                          <a:stretch>
-                            <a:fillRect/>
-                          </a:stretch>
-                        </pic:blipFill>
-                        <pic:spPr bwMode="auto">
-                          <a:xfrm>
-                            <a:off x="0" y="0"/>
-                            <a:ext cx="832677" cy="912599"/>
-                          </a:xfrm>
-                          <a:prstGeom prst="rect">
-                            <a:avLst/>
-                          </a:prstGeom>
-                          <a:noFill/>
-                          <a:ln>
-                            <a:noFill/>
-                          </a:ln>
-                        </pic:spPr>
-                      </pic:pic>
-                    </a:graphicData>
-                  </a:graphic>
-                </wp:inline>
-              </w:drawing>
-            </w:r>
-            <w:r>
-              <w:rPr>
-                <w:rFonts w:eastAsia="Times New Roman"/>
-              </w:rPr>
-              <w:br/>
-            </w:r>
-            <w:r>
-              <w:rPr>
-                <w:rFonts w:eastAsia="Times New Roman"/>
-              </w:rPr>
-              <w:br/>
-            </w:r>
-            <w:r>
-              <w:rPr>
-                <w:rFonts w:eastAsia="Times New Roman"/>
-              </w:rPr>
-              <w:t>LU-8</w:t>
-            </w:r>
-          </w:p>
-        </w:tc>
-        <w:tc>
-          <w:tcPr>
-            <w:tcW w:w="1558" w:type="dxa"/>
-          </w:tcPr>
-          <w:p>
-            <w:pPr>
-              <w:pStyle w:val="Heading2"/>
-              <w:spacing w:after="150"/>
-              <w:jc w:val="center"/>
-              <w:rPr>
-                <w:rFonts w:eastAsia="Times New Roman"/>
-              </w:rPr>
-            </w:pPr>
-            <w:r>
-              <w:rPr>
-                <w:rFonts w:eastAsia="Times New Roman"/>
-                <w:noProof/>
-              </w:rPr>
-              <w:drawing>
-                <wp:inline distT="0" distB="0" distL="0" distR="0" wp14:anchorId="736A6D6A" wp14:editId="10699413">
-                  <wp:extent cx="885825" cy="885825"/>
-                  <wp:effectExtent l="0" t="0" r="9525" b="9525"/>
-                  <wp:docPr id="20" name="Picture 20"/>
-                  <wp:cNvGraphicFramePr>
-                    <a:graphicFrameLocks xmlns:a="http://schemas.openxmlformats.org/drawingml/2006/main" noChangeAspect="1"/>
-                  </wp:cNvGraphicFramePr>
-                  <a:graphic xmlns:a="http://schemas.openxmlformats.org/drawingml/2006/main">
-                    <a:graphicData uri="http://schemas.openxmlformats.org/drawingml/2006/picture">
-                      <pic:pic xmlns:pic="http://schemas.openxmlformats.org/drawingml/2006/picture">
-                        <pic:nvPicPr>
-                          <pic:cNvPr id="0" name="Picture 5"/>
-                          <pic:cNvPicPr>
-                            <a:picLocks noChangeAspect="1" noChangeArrowheads="1"/>
-                          </pic:cNvPicPr>
-                        </pic:nvPicPr>
-                        <pic:blipFill>
-                          <a:blip r:embed="rId13" cstate="print">
-                            <a:extLst>
-                              <a:ext uri="{28A0092B-C50C-407E-A947-70E740481C1C}">
-                                <a14:useLocalDpi xmlns:a14="http://schemas.microsoft.com/office/drawing/2010/main" val="0"/>
-                              </a:ext>
-                            </a:extLst>
-                          </a:blip>
-                          <a:srcRect/>
-                          <a:stretch>
-                            <a:fillRect/>
-                          </a:stretch>
-                        </pic:blipFill>
-                        <pic:spPr bwMode="auto">
-                          <a:xfrm>
-                            <a:off x="0" y="0"/>
-                            <a:ext cx="885825" cy="885825"/>
-                          </a:xfrm>
-                          <a:prstGeom prst="rect">
-                            <a:avLst/>
-                          </a:prstGeom>
-                          <a:noFill/>
-                          <a:ln>
-                            <a:noFill/>
-                          </a:ln>
-                        </pic:spPr>
-                      </pic:pic>
-                    </a:graphicData>
-                  </a:graphic>
-                </wp:inline>
-              </w:drawing>
-            </w:r>
-            <w:r>
-              <w:rPr>
-                <w:rFonts w:eastAsia="Times New Roman"/>
-              </w:rPr>
-              <w:br/>
-            </w:r>
-            <w:r>
-              <w:rPr>
-                <w:rFonts w:eastAsia="Times New Roman"/>
-              </w:rPr>
-              <w:br/>
-            </w:r>
-            <w:r>
-              <w:rPr>
-                <w:rFonts w:eastAsia="Times New Roman"/>
-              </w:rPr>
-              <w:t>LI-1</w:t>
-            </w:r>
-          </w:p>
-        </w:tc>
-        <w:tc>
-          <w:tcPr>
-            <w:tcW w:w="1558" w:type="dxa"/>
-          </w:tcPr>
-          <w:p>
-            <w:pPr>
-              <w:pStyle w:val="Heading2"/>
-              <w:spacing w:after="150"/>
-              <w:jc w:val="center"/>
-              <w:rPr>
-                <w:rFonts w:eastAsia="Times New Roman"/>
-              </w:rPr>
-            </w:pPr>
-            <w:r>
-              <w:rPr>
-                <w:rFonts w:eastAsia="Times New Roman"/>
-                <w:noProof/>
-              </w:rPr>
-              <w:drawing>
-                <wp:inline distT="0" distB="0" distL="0" distR="0" wp14:anchorId="333A2C61" wp14:editId="0BD4D11C">
-                  <wp:extent cx="990600" cy="914400"/>
-                  <wp:effectExtent l="0" t="0" r="0" b="0"/>
-                  <wp:docPr id="8" name="Picture 8"/>
-                  <wp:cNvGraphicFramePr>
-                    <a:graphicFrameLocks xmlns:a="http://schemas.openxmlformats.org/drawingml/2006/main" noChangeAspect="1"/>
-                  </wp:cNvGraphicFramePr>
-                  <a:graphic xmlns:a="http://schemas.openxmlformats.org/drawingml/2006/main">
-                    <a:graphicData uri="http://schemas.openxmlformats.org/drawingml/2006/picture">
-                      <pic:pic xmlns:pic="http://schemas.openxmlformats.org/drawingml/2006/picture">
-                        <pic:nvPicPr>
-                          <pic:cNvPr id="0" name="Picture 2"/>
-                          <pic:cNvPicPr>
-                            <a:picLocks noChangeAspect="1" noChangeArrowheads="1"/>
-                          </pic:cNvPicPr>
-                        </pic:nvPicPr>
-                        <pic:blipFill>
-                          <a:blip r:embed="rId14" cstate="print">
-                            <a:extLst>
-                              <a:ext uri="{28A0092B-C50C-407E-A947-70E740481C1C}">
-                                <a14:useLocalDpi xmlns:a14="http://schemas.microsoft.com/office/drawing/2010/main" val="0"/>
-                              </a:ext>
-                            </a:extLst>
-                          </a:blip>
-                          <a:srcRect/>
-                          <a:stretch>
-                            <a:fillRect/>
-                          </a:stretch>
-                        </pic:blipFill>
-                        <pic:spPr bwMode="auto">
-                          <a:xfrm>
-                            <a:off x="0" y="0"/>
-                            <a:ext cx="1008459" cy="930885"/>
-                          </a:xfrm>
-                          <a:prstGeom prst="rect">
-                            <a:avLst/>
-                          </a:prstGeom>
-                          <a:noFill/>
-                          <a:ln>
-                            <a:noFill/>
-                          </a:ln>
-                        </pic:spPr>
-                      </pic:pic>
-                    </a:graphicData>
-                  </a:graphic>
-                </wp:inline>
-              </w:drawing>
-            </w:r>
-            <w:r>
-              <w:rPr>
-                <w:rFonts w:eastAsia="Times New Roman"/>
-              </w:rPr>
-              <w:br/>
-            </w:r>
-            <w:r>
-              <w:rPr>
-                <w:rFonts w:eastAsia="Times New Roman"/>
-              </w:rPr>
-              <w:br/>
-            </w:r>
-            <w:r>
-              <w:rPr>
-                <w:rFonts w:eastAsia="Times New Roman"/>
-              </w:rPr>
-              <w:t>ST-36</w:t>
-            </w:r>
-          </w:p>
-        </w:tc>
-        <w:tc>
-          <w:tcPr>
-            <w:tcW w:w="1558" w:type="dxa"/>
-          </w:tcPr>
-          <w:p>
-            <w:pPr>
-              <w:pStyle w:val="Heading2"/>
-              <w:spacing w:after="150"/>
-              <w:jc w:val="center"/>
-              <w:rPr>
-                <w:rFonts w:eastAsia="Times New Roman"/>
-              </w:rPr>
-            </w:pPr>
-            <w:r>
-              <w:rPr>
-                <w:rFonts w:eastAsia="Times New Roman"/>
-                <w:noProof/>
-              </w:rPr>
-              <w:drawing>
-                <wp:inline distT="0" distB="0" distL="0" distR="0" wp14:anchorId="03A270B7" wp14:editId="72E19659">
-                  <wp:extent cx="902768" cy="885825"/>
-                  <wp:effectExtent l="0" t="0" r="0" b="0"/>
-                  <wp:docPr id="30" name="Picture 30"/>
-                  <wp:cNvGraphicFramePr>
-                    <a:graphicFrameLocks xmlns:a="http://schemas.openxmlformats.org/drawingml/2006/main" noChangeAspect="1"/>
-                  </wp:cNvGraphicFramePr>
-                  <a:graphic xmlns:a="http://schemas.openxmlformats.org/drawingml/2006/main">
-                    <a:graphicData uri="http://schemas.openxmlformats.org/drawingml/2006/picture">
-                      <pic:pic xmlns:pic="http://schemas.openxmlformats.org/drawingml/2006/picture">
-                        <pic:nvPicPr>
-                          <pic:cNvPr id="0" name="Picture 13"/>
-                          <pic:cNvPicPr>
-                            <a:picLocks noChangeAspect="1" noChangeArrowheads="1"/>
-                          </pic:cNvPicPr>
-                        </pic:nvPicPr>
-                        <pic:blipFill>
-                          <a:blip r:embed="rId15" cstate="print">
-                            <a:extLst>
-                              <a:ext uri="{28A0092B-C50C-407E-A947-70E740481C1C}">
-                                <a14:useLocalDpi xmlns:a14="http://schemas.microsoft.com/office/drawing/2010/main" val="0"/>
-                              </a:ext>
-                            </a:extLst>
-                          </a:blip>
-                          <a:srcRect/>
-                          <a:stretch>
-                            <a:fillRect/>
-                          </a:stretch>
-                        </pic:blipFill>
-                        <pic:spPr bwMode="auto">
-                          <a:xfrm>
-                            <a:off x="0" y="0"/>
-                            <a:ext cx="933221" cy="915706"/>
-                          </a:xfrm>
-                          <a:prstGeom prst="rect">
-                            <a:avLst/>
-                          </a:prstGeom>
-                          <a:noFill/>
-                          <a:ln>
-                            <a:noFill/>
-                          </a:ln>
-                        </pic:spPr>
-                      </pic:pic>
-                    </a:graphicData>
-                  </a:graphic>
-                </wp:inline>
-              </w:drawing>
-            </w:r>
-            <w:r>
-              <w:rPr>
-                <w:rFonts w:eastAsia="Times New Roman"/>
-              </w:rPr>
-              <w:br/>
-            </w:r>
-            <w:r>
-              <w:rPr>
-                <w:rFonts w:eastAsia="Times New Roman"/>
-              </w:rPr>
-              <w:br/>
-            </w:r>
-            <w:r>
-              <w:rPr>
-                <w:rFonts w:eastAsia="Times New Roman"/>
-              </w:rPr>
-              <w:t>SP-10</w:t>
-            </w:r>
-          </w:p>
-        </w:tc>
-        <w:tc>
-          <w:tcPr>
-            <w:tcW w:w="1559" w:type="dxa"/>
-          </w:tcPr>
-          <w:p>
-            <w:pPr>
-              <w:pStyle w:val="Heading2"/>
-              <w:spacing w:after="150"/>
-              <w:jc w:val="center"/>
-              <w:rPr>
-                <w:rFonts w:eastAsia="Times New Roman"/>
-              </w:rPr>
-            </w:pPr>
-            <w:r>
-              <w:rPr>
-                <w:noProof/>
-              </w:rPr>
-              <w:drawing>
-                <wp:inline distT="0" distB="0" distL="0" distR="0" wp14:anchorId="04300EC9" wp14:editId="45715A8A">
-                  <wp:extent cx="808905" cy="886545"/>
-                  <wp:effectExtent l="0" t="0" r="0" b="8890"/>
-                  <wp:docPr id="5" name="Picture 5"/>
-                  <wp:cNvGraphicFramePr>
-                    <a:graphicFrameLocks xmlns:a="http://schemas.openxmlformats.org/drawingml/2006/main" noChangeAspect="1"/>
-                  </wp:cNvGraphicFramePr>
-                  <a:graphic xmlns:a="http://schemas.openxmlformats.org/drawingml/2006/main">
-                    <a:graphicData uri="http://schemas.openxmlformats.org/drawingml/2006/picture">
-                      <pic:pic xmlns:pic="http://schemas.openxmlformats.org/drawingml/2006/picture">
-                        <pic:nvPicPr>
-                          <pic:cNvPr id="0" name="Picture 1"/>
-                          <pic:cNvPicPr>
-                            <a:picLocks noChangeAspect="1" noChangeArrowheads="1"/>
-                          </pic:cNvPicPr>
-                        </pic:nvPicPr>
-                        <pic:blipFill>
-                          <a:blip r:embed="rId16" cstate="print">
-                            <a:extLst>
-                              <a:ext uri="{28A0092B-C50C-407E-A947-70E740481C1C}">
-                                <a14:useLocalDpi xmlns:a14="http://schemas.microsoft.com/office/drawing/2010/main" val="0"/>
-                              </a:ext>
-                            </a:extLst>
-                          </a:blip>
-                          <a:srcRect/>
-                          <a:stretch>
-                            <a:fillRect/>
-                          </a:stretch>
-                        </pic:blipFill>
-                        <pic:spPr bwMode="auto">
-                          <a:xfrm>
-                            <a:off x="0" y="0"/>
-                            <a:ext cx="865775" cy="948873"/>
-                          </a:xfrm>
-                          <a:prstGeom prst="rect">
-                            <a:avLst/>
-                          </a:prstGeom>
-                          <a:noFill/>
-                          <a:ln>
-                            <a:noFill/>
-                          </a:ln>
-                        </pic:spPr>
-                      </pic:pic>
-                    </a:graphicData>
-                  </a:graphic>
-                </wp:inline>
-              </w:drawing>
-            </w:r>
-            <w:r>
-              <w:rPr>
-                <w:rFonts w:eastAsia="Times New Roman"/>
-              </w:rPr>
-              <w:br/>
-            </w:r>
-            <w:r>
-              <w:rPr>
-                <w:rFonts w:eastAsia="Times New Roman"/>
-              </w:rPr>
-              <w:br/>
-            </w:r>
-            <w:r>
-              <w:rPr>
-                <w:rFonts w:eastAsia="Times New Roman"/>
-              </w:rPr>
-              <w:t>HT-8</w:t>
-            </w:r>
-          </w:p>
-        </w:tc>
-        <w:tc>
-          <w:tcPr>
-            <w:tcW w:w="1559" w:type="dxa"/>
-          </w:tcPr>
-          <w:p>
-            <w:pPr>
-              <w:pStyle w:val="Heading2"/>
-              <w:spacing w:after="150"/>
-              <w:jc w:val="center"/>
-              <w:rPr>
-                <w:rFonts w:eastAsia="Times New Roman"/>
-              </w:rPr>
-            </w:pPr>
-            <w:r>
-              <w:rPr>
-                <w:noProof/>
-              </w:rPr>
-              <w:drawing>
-                <wp:inline distT="0" distB="0" distL="0" distR="0" wp14:anchorId="4BDD36EA" wp14:editId="37902356">
-                  <wp:extent cx="815779" cy="894080"/>
-                  <wp:effectExtent l="0" t="0" r="3810" b="1270"/>
-                  <wp:docPr id="19" name="Picture 19"/>
-                  <wp:cNvGraphicFramePr>
-                    <a:graphicFrameLocks xmlns:a="http://schemas.openxmlformats.org/drawingml/2006/main" noChangeAspect="1"/>
-                  </wp:cNvGraphicFramePr>
-                  <a:graphic xmlns:a="http://schemas.openxmlformats.org/drawingml/2006/main">
-                    <a:graphicData uri="http://schemas.openxmlformats.org/drawingml/2006/picture">
-                      <pic:pic xmlns:pic="http://schemas.openxmlformats.org/drawingml/2006/picture">
-                        <pic:nvPicPr>
-                          <pic:cNvPr id="0" name="Picture 4"/>
-                          <pic:cNvPicPr>
-                            <a:picLocks noChangeAspect="1" noChangeArrowheads="1"/>
-                          </pic:cNvPicPr>
-                        </pic:nvPicPr>
-                        <pic:blipFill>
-                          <a:blip r:embed="rId17" cstate="print">
-                            <a:extLst>
-                              <a:ext uri="{28A0092B-C50C-407E-A947-70E740481C1C}">
-                                <a14:useLocalDpi xmlns:a14="http://schemas.microsoft.com/office/drawing/2010/main" val="0"/>
-                              </a:ext>
-                            </a:extLst>
-                          </a:blip>
-                          <a:srcRect/>
-                          <a:stretch>
-                            <a:fillRect/>
-                          </a:stretch>
-                        </pic:blipFill>
-                        <pic:spPr bwMode="auto">
-                          <a:xfrm>
-                            <a:off x="0" y="0"/>
-                            <a:ext cx="841061" cy="921788"/>
-                          </a:xfrm>
-                          <a:prstGeom prst="rect">
-                            <a:avLst/>
-                          </a:prstGeom>
-                          <a:noFill/>
-                          <a:ln>
-                            <a:noFill/>
-                          </a:ln>
-                        </pic:spPr>
-                      </pic:pic>
-                    </a:graphicData>
-                  </a:graphic>
-                </wp:inline>
-              </w:drawing>
-            </w:r>
-            <w:r>
-              <w:rPr>
-                <w:rFonts w:eastAsia="Times New Roman"/>
-              </w:rPr>
-              <w:br/>
-            </w:r>
-            <w:r>
-              <w:rPr>
-                <w:rFonts w:eastAsia="Times New Roman"/>
-              </w:rPr>
-              <w:br/>
-            </w:r>
-            <w:r>
-              <w:rPr>
-                <w:rFonts w:eastAsia="Times New Roman"/>
-              </w:rPr>
-              <w:t>SI-5</w:t>
-            </w:r>
-          </w:p>
-        </w:tc>
-      </w:tr>
-      <w:tr>
-        <w:tc>
-          <w:tcPr>
-            <w:tcW w:w="1558" w:type="dxa"/>
-          </w:tcPr>
-          <w:p>
-            <w:pPr>
-              <w:pStyle w:val="Heading2"/>
-              <w:spacing w:after="150"/>
-              <w:jc w:val="center"/>
-              <w:rPr>
-                <w:rFonts w:eastAsia="Times New Roman"/>
-              </w:rPr>
-            </w:pPr>
-            <w:r>
-              <w:rPr>
-                <w:rFonts w:eastAsia="Times New Roman"/>
-                <w:noProof/>
-              </w:rPr>
-              <w:drawing>
-                <wp:inline distT="0" distB="0" distL="0" distR="0" wp14:anchorId="7B991A58" wp14:editId="08269422">
-                  <wp:extent cx="771525" cy="771525"/>
-                  <wp:effectExtent l="0" t="0" r="9525" b="9525"/>
-                  <wp:docPr id="29" name="Picture 29"/>
-                  <wp:cNvGraphicFramePr>
-                    <a:graphicFrameLocks xmlns:a="http://schemas.openxmlformats.org/drawingml/2006/main" noChangeAspect="1"/>
-                  </wp:cNvGraphicFramePr>
-                  <a:graphic xmlns:a="http://schemas.openxmlformats.org/drawingml/2006/main">
-                    <a:graphicData uri="http://schemas.openxmlformats.org/drawingml/2006/picture">
-                      <pic:pic xmlns:pic="http://schemas.openxmlformats.org/drawingml/2006/picture">
-                        <pic:nvPicPr>
-                          <pic:cNvPr id="0" name="Picture 12"/>
-                          <pic:cNvPicPr>
-                            <a:picLocks noChangeAspect="1" noChangeArrowheads="1"/>
-                          </pic:cNvPicPr>
-                        </pic:nvPicPr>
-                        <pic:blipFill>
-                          <a:blip r:embed="rId18" cstate="print">
-                            <a:extLst>
-                              <a:ext uri="{28A0092B-C50C-407E-A947-70E740481C1C}">
-                                <a14:useLocalDpi xmlns:a14="http://schemas.microsoft.com/office/drawing/2010/main" val="0"/>
-                              </a:ext>
-                            </a:extLst>
-                          </a:blip>
-                          <a:srcRect/>
-                          <a:stretch>
-                            <a:fillRect/>
-                          </a:stretch>
-                        </pic:blipFill>
-                        <pic:spPr bwMode="auto">
-                          <a:xfrm>
-                            <a:off x="0" y="0"/>
-                            <a:ext cx="771525" cy="771525"/>
-                          </a:xfrm>
-                          <a:prstGeom prst="rect">
-                            <a:avLst/>
-                          </a:prstGeom>
-                          <a:noFill/>
-                          <a:ln>
-                            <a:noFill/>
-                          </a:ln>
-                        </pic:spPr>
-                      </pic:pic>
-                    </a:graphicData>
-                  </a:graphic>
-                </wp:inline>
-              </w:drawing>
-            </w:r>
-            <w:r>
-              <w:rPr>
-                <w:rFonts w:eastAsia="Times New Roman"/>
-              </w:rPr>
-              <w:br/>
-            </w:r>
-            <w:r>
-              <w:rPr>
-                <w:rFonts w:eastAsia="Times New Roman"/>
-              </w:rPr>
-              <w:br/>
-            </w:r>
-            <w:r>
-              <w:rPr>
-                <w:rFonts w:eastAsia="Times New Roman"/>
-              </w:rPr>
-              <w:t>BL-2</w:t>
-            </w:r>
-          </w:p>
-        </w:tc>
-        <w:tc>
-          <w:tcPr>
-            <w:tcW w:w="1558" w:type="dxa"/>
-          </w:tcPr>
-          <w:p>
-            <w:pPr>
-              <w:pStyle w:val="Heading2"/>
-              <w:spacing w:after="150"/>
-              <w:jc w:val="center"/>
-              <w:rPr>
-                <w:rFonts w:eastAsia="Times New Roman"/>
-              </w:rPr>
-            </w:pPr>
-            <w:r>
-              <w:rPr>
-                <w:rFonts w:eastAsia="Times New Roman"/>
-                <w:noProof/>
-              </w:rPr>
-              <w:drawing>
-                <wp:inline distT="0" distB="0" distL="0" distR="0" wp14:anchorId="788096A1" wp14:editId="5D15A3F9">
-                  <wp:extent cx="758190" cy="756313"/>
-                  <wp:effectExtent l="0" t="0" r="3810" b="5715"/>
-                  <wp:docPr id="26" name="Picture 26"/>
-                  <wp:cNvGraphicFramePr>
-                    <a:graphicFrameLocks xmlns:a="http://schemas.openxmlformats.org/drawingml/2006/main" noChangeAspect="1"/>
-                  </wp:cNvGraphicFramePr>
-                  <a:graphic xmlns:a="http://schemas.openxmlformats.org/drawingml/2006/main">
-                    <a:graphicData uri="http://schemas.openxmlformats.org/drawingml/2006/picture">
-                      <pic:pic xmlns:pic="http://schemas.openxmlformats.org/drawingml/2006/picture">
-                        <pic:nvPicPr>
-                          <pic:cNvPr id="0" name="Picture 9"/>
-                          <pic:cNvPicPr>
-                            <a:picLocks noChangeAspect="1" noChangeArrowheads="1"/>
-                          </pic:cNvPicPr>
-                        </pic:nvPicPr>
-                        <pic:blipFill>
-                          <a:blip r:embed="rId19" cstate="print">
-                            <a:extLst>
-                              <a:ext uri="{28A0092B-C50C-407E-A947-70E740481C1C}">
-                                <a14:useLocalDpi xmlns:a14="http://schemas.microsoft.com/office/drawing/2010/main" val="0"/>
-                              </a:ext>
-                            </a:extLst>
-                          </a:blip>
-                          <a:srcRect/>
-                          <a:stretch>
-                            <a:fillRect/>
-                          </a:stretch>
-                        </pic:blipFill>
-                        <pic:spPr bwMode="auto">
-                          <a:xfrm>
-                            <a:off x="0" y="0"/>
-                            <a:ext cx="785761" cy="783816"/>
-                          </a:xfrm>
-                          <a:prstGeom prst="rect">
-                            <a:avLst/>
-                          </a:prstGeom>
-                          <a:noFill/>
-                          <a:ln>
-                            <a:noFill/>
-                          </a:ln>
-                        </pic:spPr>
-                      </pic:pic>
-                    </a:graphicData>
-                  </a:graphic>
-                </wp:inline>
-              </w:drawing>
-            </w:r>
-            <w:r>
-              <w:rPr>
-                <w:rFonts w:eastAsia="Times New Roman"/>
-              </w:rPr>
-              <w:br/>
-            </w:r>
-            <w:r>
-              <w:rPr>
-                <w:rFonts w:eastAsia="Times New Roman"/>
-              </w:rPr>
-              <w:br/>
-            </w:r>
-            <w:r>
-              <w:rPr>
-                <w:rFonts w:eastAsia="Times New Roman"/>
-              </w:rPr>
-              <w:t>KI-27</w:t>
-            </w:r>
-          </w:p>
-        </w:tc>
-        <w:tc>
-          <w:tcPr>
-            <w:tcW w:w="1558" w:type="dxa"/>
-          </w:tcPr>
-          <w:p>
-            <w:pPr>
-              <w:pStyle w:val="Heading2"/>
-              <w:spacing w:after="150"/>
-              <w:jc w:val="center"/>
-              <w:rPr>
-                <w:rFonts w:eastAsia="Times New Roman"/>
-              </w:rPr>
-            </w:pPr>
-            <w:r>
-              <w:rPr>
-                <w:noProof/>
-              </w:rPr>
-              <w:drawing>
-                <wp:inline distT="0" distB="0" distL="0" distR="0" wp14:anchorId="31188E2C" wp14:editId="39C584E2">
-                  <wp:extent cx="694690" cy="761367"/>
-                  <wp:effectExtent l="0" t="0" r="0" b="635"/>
-                  <wp:docPr id="10" name="Picture 10"/>
-                  <wp:cNvGraphicFramePr>
-                    <a:graphicFrameLocks xmlns:a="http://schemas.openxmlformats.org/drawingml/2006/main" noChangeAspect="1"/>
-                  </wp:cNvGraphicFramePr>
-                  <a:graphic xmlns:a="http://schemas.openxmlformats.org/drawingml/2006/main">
-                    <a:graphicData uri="http://schemas.openxmlformats.org/drawingml/2006/picture">
-                      <pic:pic xmlns:pic="http://schemas.openxmlformats.org/drawingml/2006/picture">
-                        <pic:nvPicPr>
-                          <pic:cNvPr id="0" name="Picture 3"/>
-                          <pic:cNvPicPr>
-                            <a:picLocks noChangeAspect="1" noChangeArrowheads="1"/>
-                          </pic:cNvPicPr>
-                        </pic:nvPicPr>
-                        <pic:blipFill>
-                          <a:blip r:embed="rId20" cstate="print">
-                            <a:extLst>
-                              <a:ext uri="{28A0092B-C50C-407E-A947-70E740481C1C}">
-                                <a14:useLocalDpi xmlns:a14="http://schemas.microsoft.com/office/drawing/2010/main" val="0"/>
-                              </a:ext>
-                            </a:extLst>
-                          </a:blip>
-                          <a:srcRect/>
-                          <a:stretch>
-                            <a:fillRect/>
-                          </a:stretch>
-                        </pic:blipFill>
-                        <pic:spPr bwMode="auto">
-                          <a:xfrm>
-                            <a:off x="0" y="0"/>
-                            <a:ext cx="744047" cy="815461"/>
-                          </a:xfrm>
-                          <a:prstGeom prst="rect">
-                            <a:avLst/>
-                          </a:prstGeom>
-                          <a:noFill/>
-                          <a:ln>
-                            <a:noFill/>
-                          </a:ln>
-                        </pic:spPr>
-                      </pic:pic>
-                    </a:graphicData>
-                  </a:graphic>
-                </wp:inline>
-              </w:drawing>
-            </w:r>
-            <w:r>
-              <w:rPr>
-                <w:rFonts w:eastAsia="Times New Roman"/>
-              </w:rPr>
-              <w:br/>
-            </w:r>
-            <w:r>
-              <w:rPr>
-                <w:rFonts w:eastAsia="Times New Roman"/>
-              </w:rPr>
-              <w:br/>
-            </w:r>
-            <w:r>
-              <w:rPr>
-                <w:rFonts w:eastAsia="Times New Roman"/>
-              </w:rPr>
-              <w:t>PC-8</w:t>
-            </w:r>
-          </w:p>
-        </w:tc>
-        <w:tc>
-          <w:tcPr>
-            <w:tcW w:w="1558" w:type="dxa"/>
-          </w:tcPr>
-          <w:p>
-            <w:pPr>
-              <w:pStyle w:val="Heading2"/>
-              <w:spacing w:after="150"/>
-              <w:jc w:val="center"/>
-              <w:rPr>
-                <w:rFonts w:eastAsia="Times New Roman"/>
-              </w:rPr>
-            </w:pPr>
-            <w:r>
-              <w:rPr>
-                <w:noProof/>
-              </w:rPr>
-              <w:drawing>
-                <wp:inline distT="0" distB="0" distL="0" distR="0" wp14:anchorId="3C402132" wp14:editId="5208E9A8">
-                  <wp:extent cx="771525" cy="771525"/>
-                  <wp:effectExtent l="0" t="0" r="9525" b="9525"/>
-                  <wp:docPr id="18" name="Picture 18"/>
-                  <wp:cNvGraphicFramePr>
-                    <a:graphicFrameLocks xmlns:a="http://schemas.openxmlformats.org/drawingml/2006/main" noChangeAspect="1"/>
-                  </wp:cNvGraphicFramePr>
-                  <a:graphic xmlns:a="http://schemas.openxmlformats.org/drawingml/2006/main">
-                    <a:graphicData uri="http://schemas.openxmlformats.org/drawingml/2006/picture">
-                      <pic:pic xmlns:pic="http://schemas.openxmlformats.org/drawingml/2006/picture">
-                        <pic:nvPicPr>
-                          <pic:cNvPr id="0" name="Picture 21"/>
-                          <pic:cNvPicPr>
-                            <a:picLocks noChangeAspect="1" noChangeArrowheads="1"/>
-                          </pic:cNvPicPr>
-                        </pic:nvPicPr>
-                        <pic:blipFill>
-                          <a:blip r:embed="rId21" cstate="print">
-                            <a:extLst>
-                              <a:ext uri="{28A0092B-C50C-407E-A947-70E740481C1C}">
-                                <a14:useLocalDpi xmlns:a14="http://schemas.microsoft.com/office/drawing/2010/main" val="0"/>
-                              </a:ext>
-                            </a:extLst>
-                          </a:blip>
-                          <a:srcRect/>
-                          <a:stretch>
-                            <a:fillRect/>
-                          </a:stretch>
-                        </pic:blipFill>
-                        <pic:spPr bwMode="auto">
-                          <a:xfrm>
-                            <a:off x="0" y="0"/>
-                            <a:ext cx="771525" cy="771525"/>
-                          </a:xfrm>
-                          <a:prstGeom prst="rect">
-                            <a:avLst/>
-                          </a:prstGeom>
-                          <a:noFill/>
-                          <a:ln>
-                            <a:noFill/>
-                          </a:ln>
-                        </pic:spPr>
-                      </pic:pic>
-                    </a:graphicData>
-                  </a:graphic>
-                </wp:inline>
-              </w:drawing>
-            </w:r>
-            <w:r>
-              <w:rPr>
-                <w:rFonts w:eastAsia="Times New Roman"/>
-              </w:rPr>
-              <w:br/>
-            </w:r>
-            <w:r>
-              <w:rPr>
-                <w:rFonts w:eastAsia="Times New Roman"/>
-              </w:rPr>
-              <w:br/>
-            </w:r>
-            <w:r>
-              <w:rPr>
-                <w:rFonts w:eastAsia="Times New Roman"/>
-              </w:rPr>
-              <w:t>SJ-6</w:t>
-            </w:r>
-          </w:p>
-        </w:tc>
-        <w:tc>
-          <w:tcPr>
-            <w:tcW w:w="1559" w:type="dxa"/>
-          </w:tcPr>
-          <w:p>
-            <w:pPr>
-              <w:pStyle w:val="Heading2"/>
-              <w:spacing w:after="150"/>
-              <w:jc w:val="center"/>
-            </w:pPr>
-            <w:r>
-              <w:rPr>
-                <w:noProof/>
-              </w:rPr>
-              <w:drawing>
-                <wp:inline distT="0" distB="0" distL="0" distR="0" wp14:anchorId="24DC6C7E" wp14:editId="1BCF2D31">
-                  <wp:extent cx="762000" cy="777149"/>
-                  <wp:effectExtent l="0" t="0" r="0" b="4445"/>
-                  <wp:docPr id="3" name="Picture 3"/>
-                  <wp:cNvGraphicFramePr>
-                    <a:graphicFrameLocks xmlns:a="http://schemas.openxmlformats.org/drawingml/2006/main" noChangeAspect="1"/>
-                  </wp:cNvGraphicFramePr>
-                  <a:graphic xmlns:a="http://schemas.openxmlformats.org/drawingml/2006/main">
-                    <a:graphicData uri="http://schemas.openxmlformats.org/drawingml/2006/picture">
-                      <pic:pic xmlns:pic="http://schemas.openxmlformats.org/drawingml/2006/picture">
-                        <pic:nvPicPr>
-                          <pic:cNvPr id="0" name="Picture 1"/>
-                          <pic:cNvPicPr>
-                            <a:picLocks noChangeAspect="1" noChangeArrowheads="1"/>
-                          </pic:cNvPicPr>
-                        </pic:nvPicPr>
-                        <pic:blipFill>
-                          <a:blip r:embed="rId22" cstate="print">
-                            <a:extLst>
-                              <a:ext uri="{28A0092B-C50C-407E-A947-70E740481C1C}">
-                                <a14:useLocalDpi xmlns:a14="http://schemas.microsoft.com/office/drawing/2010/main" val="0"/>
-                              </a:ext>
-                            </a:extLst>
-                          </a:blip>
-                          <a:srcRect/>
-                          <a:stretch>
-                            <a:fillRect/>
-                          </a:stretch>
-                        </pic:blipFill>
-                        <pic:spPr bwMode="auto">
-                          <a:xfrm>
-                            <a:off x="0" y="0"/>
-                            <a:ext cx="793278" cy="809048"/>
-                          </a:xfrm>
-                          <a:prstGeom prst="rect">
-                            <a:avLst/>
-                          </a:prstGeom>
-                          <a:noFill/>
-                          <a:ln>
-                            <a:noFill/>
-                          </a:ln>
-                        </pic:spPr>
-                      </pic:pic>
-                    </a:graphicData>
-                  </a:graphic>
-                </wp:inline>
-              </w:drawing>
-            </w:r>
-            <w:r>
-              <w:rPr>
-                <w:rFonts w:eastAsia="Times New Roman"/>
-              </w:rPr>
-              <w:br/>
-            </w:r>
-            <w:r>
-              <w:rPr>
-                <w:rFonts w:eastAsia="Times New Roman"/>
-              </w:rPr>
-              <w:br/>
-            </w:r>
-            <w:r>
-              <w:rPr>
-                <w:rFonts w:eastAsia="Times New Roman"/>
-              </w:rPr>
-              <w:t>GB-20</w:t>
-            </w:r>
-          </w:p>
-        </w:tc>
-        <w:tc>
-          <w:tcPr>
-            <w:tcW w:w="1559" w:type="dxa"/>
-          </w:tcPr>
-          <w:p>
-            <w:pPr>
-              <w:pStyle w:val="Heading2"/>
-              <w:spacing w:after="150"/>
-              <w:jc w:val="center"/>
-              <w:rPr>
-                <w:rFonts w:eastAsia="Times New Roman"/>
-              </w:rPr>
-            </w:pPr>
-            <w:r>
-              <w:rPr>
-                <w:noProof/>
-              </w:rPr>
-              <w:drawing>
-                <wp:inline distT="0" distB="0" distL="0" distR="0" wp14:anchorId="78658874" wp14:editId="3641F085">
-                  <wp:extent cx="800100" cy="802105"/>
-                  <wp:effectExtent l="0" t="0" r="0" b="0"/>
-                  <wp:docPr id="23" name="Picture 23"/>
-                  <wp:cNvGraphicFramePr>
-                    <a:graphicFrameLocks xmlns:a="http://schemas.openxmlformats.org/drawingml/2006/main" noChangeAspect="1"/>
-                  </wp:cNvGraphicFramePr>
-                  <a:graphic xmlns:a="http://schemas.openxmlformats.org/drawingml/2006/main">
-                    <a:graphicData uri="http://schemas.openxmlformats.org/drawingml/2006/picture">
-                      <pic:pic xmlns:pic="http://schemas.openxmlformats.org/drawingml/2006/picture">
-                        <pic:nvPicPr>
-                          <pic:cNvPr id="0" name="Picture 6"/>
-                          <pic:cNvPicPr>
-                            <a:picLocks noChangeAspect="1" noChangeArrowheads="1"/>
-                          </pic:cNvPicPr>
-                        </pic:nvPicPr>
-                        <pic:blipFill>
-                          <a:blip r:embed="rId23" cstate="print">
-                            <a:extLst>
-                              <a:ext uri="{28A0092B-C50C-407E-A947-70E740481C1C}">
-                                <a14:useLocalDpi xmlns:a14="http://schemas.microsoft.com/office/drawing/2010/main" val="0"/>
-                              </a:ext>
-                            </a:extLst>
-                          </a:blip>
-                          <a:srcRect/>
-                          <a:stretch>
-                            <a:fillRect/>
-                          </a:stretch>
-                        </pic:blipFill>
-                        <pic:spPr bwMode="auto">
-                          <a:xfrm>
-                            <a:off x="0" y="0"/>
-                            <a:ext cx="845133" cy="847251"/>
-                          </a:xfrm>
-                          <a:prstGeom prst="rect">
-                            <a:avLst/>
-                          </a:prstGeom>
-                          <a:noFill/>
-                          <a:ln>
-                            <a:noFill/>
-                          </a:ln>
-                        </pic:spPr>
-                      </pic:pic>
-                    </a:graphicData>
-                  </a:graphic>
-                </wp:inline>
-              </w:drawing>
-            </w:r>
-            <w:r>
-              <w:rPr>
-                <w:rFonts w:eastAsia="Times New Roman"/>
-              </w:rPr>
-              <w:br/>
-            </w:r>
-            <w:r>
-              <w:rPr>
-                <w:rFonts w:eastAsia="Times New Roman"/>
-              </w:rPr>
-              <w:br/>
-            </w:r>
-            <w:r>
-              <w:rPr>
-                <w:rFonts w:eastAsia="Times New Roman"/>
-              </w:rPr>
-              <w:t>LIV-8</w:t>
-            </w:r>
-          </w:p>
-        </w:tc>
-      </w:tr>
-    </w:tbl>
+    <w:p>
+      <w:pPr>
+        <w:jc w:val="center"/>
+        <w:divId w:val="1808039875"/>
+      </w:pPr>
+      <w:r>
+        <w:t>Figure 3 – Point Images</w:t>
+      </w:r>
+    </w:p>
     <w:p>
       <w:pPr>
         <w:divId w:val="1808039875"/>
@@ -4435,7 +3409,7 @@
       <w:r>
         <w:t xml:space="preserve">Waterhouse, J., Reilly, T., Atkinson, G., &amp; Edwards, B. (2007). Jet lag: Trends and coping strategies. The Lancet, 369(9567), 1117–1129. </w:t>
       </w:r>
-      <w:hyperlink r:id="rId24" w:tgtFrame="_blank" w:history="1">
+      <w:hyperlink r:id="rId13" w:tgtFrame="_blank" w:history="1">
         <w:r>
           <w:rPr>
             <w:rStyle w:val="Hyperlink"/>
@@ -4491,7 +3465,7 @@
         </w:rPr>
         <w:t xml:space="preserve">Amaro, J. (2001). Time Travel: Contemporary Applications for Jet Lag from Ancient Principles. Acupuncture Today, October 2001. </w:t>
       </w:r>
-      <w:hyperlink r:id="rId25" w:tgtFrame="_blank" w:history="1">
+      <w:hyperlink r:id="rId14" w:tgtFrame="_blank" w:history="1">
         <w:r>
           <w:rPr>
             <w:rStyle w:val="Hyperlink"/>
@@ -4553,7 +3527,7 @@
         </w:rPr>
         <w:t xml:space="preserve">, 20(3), e3001567. </w:t>
       </w:r>
-      <w:hyperlink r:id="rId26" w:tgtFrame="_blank" w:history="1">
+      <w:hyperlink r:id="rId15" w:tgtFrame="_blank" w:history="1">
         <w:r>
           <w:rPr>
             <w:rStyle w:val="Hyperlink"/>
@@ -4615,7 +3589,7 @@
         </w:rPr>
         <w:t xml:space="preserve">The mammalian circadian timing system and the suprachiasmatic nucleus as its pacemaker. Biology, 8(1), 13. </w:t>
       </w:r>
-      <w:hyperlink r:id="rId27" w:tgtFrame="_blank" w:history="1">
+      <w:hyperlink r:id="rId16" w:tgtFrame="_blank" w:history="1">
         <w:r>
           <w:rPr>
             <w:rStyle w:val="Hyperlink"/>
@@ -4652,7 +3626,7 @@
         </w:rPr>
         <w:t xml:space="preserve">, G.K., &amp; FitzGerald, G.A. (2010). Circadian clocks and vascular function. Circulation Research, 106(5), 833-841. </w:t>
       </w:r>
-      <w:hyperlink r:id="rId28" w:tgtFrame="_blank" w:history="1">
+      <w:hyperlink r:id="rId17" w:tgtFrame="_blank" w:history="1">
         <w:r>
           <w:rPr>
             <w:rStyle w:val="Hyperlink"/>
@@ -4681,7 +3655,7 @@
         </w:rPr>
         <w:t xml:space="preserve">Hastings, M. H., et al. (2003). A clockwork web: circadian timing in brain and periphery. Nature Reviews Neuroscience, 4(8), 649–661. </w:t>
       </w:r>
-      <w:hyperlink r:id="rId29" w:tgtFrame="_blank" w:history="1">
+      <w:hyperlink r:id="rId18" w:tgtFrame="_blank" w:history="1">
         <w:r>
           <w:rPr>
             <w:rStyle w:val="Hyperlink"/>
@@ -4760,7 +3734,7 @@
         </w:rPr>
         <w:t xml:space="preserve">, 3, e03674. </w:t>
       </w:r>
-      <w:hyperlink r:id="rId30" w:tgtFrame="_blank" w:history="1">
+      <w:hyperlink r:id="rId19" w:tgtFrame="_blank" w:history="1">
         <w:r>
           <w:rPr>
             <w:rStyle w:val="Hyperlink"/>
@@ -4797,7 +3771,7 @@
         </w:rPr>
         <w:t xml:space="preserve">, I., &amp; Oster, H. (2019). Differentiating external zeitgeber impact on peripheral circadian clock resetting. Scientific Reports, 9, 20114. </w:t>
       </w:r>
-      <w:hyperlink r:id="rId31" w:tgtFrame="_blank" w:history="1">
+      <w:hyperlink r:id="rId20" w:tgtFrame="_blank" w:history="1">
         <w:r>
           <w:rPr>
             <w:rStyle w:val="Hyperlink"/>
@@ -4826,7 +3800,7 @@
         </w:rPr>
         <w:t xml:space="preserve">Wu, J., &amp; Zhao, Z. (2024). Acupuncture in circadian rhythm sleep–wake disorders and its potential neurochemical mechanisms. Frontiers in Neuroscience, 18, 1346635. </w:t>
       </w:r>
-      <w:hyperlink r:id="rId32" w:tgtFrame="_blank" w:history="1">
+      <w:hyperlink r:id="rId21" w:tgtFrame="_blank" w:history="1">
         <w:r>
           <w:rPr>
             <w:rStyle w:val="Hyperlink"/>
@@ -4863,7 +3837,7 @@
 </file>
 
 <file path=word/numbering.xml><?xml version="1.0" encoding="utf-8"?>
-<w:numbering xmlns:wpc="http://schemas.microsoft.com/office/word/2010/wordprocessingCanvas" xmlns:cx="http://schemas.microsoft.com/office/drawing/2014/chartex" xmlns:cx1="http://schemas.microsoft.com/office/drawing/2015/9/8/chartex" xmlns:cx2="http://schemas.microsoft.com/office/drawing/2015/10/21/chartex" xmlns:cx3="http://schemas.microsoft.com/office/drawing/2016/5/9/chartex" xmlns:cx4="http://schemas.microsoft.com/office/drawing/2016/5/10/chartex" xmlns:cx5="http://schemas.microsoft.com/office/drawing/2016/5/11/chartex" xmlns:cx6="http://schemas.microsoft.com/office/drawing/2016/5/12/chartex" xmlns:cx7="http://schemas.microsoft.com/office/drawing/2016/5/13/chartex" xmlns:cx8="http://schemas.microsoft.com/office/drawing/2016/5/14/chartex" xmlns:mc="http://schemas.openxmlformats.org/markup-compatibility/2006" xmlns:aink="http://schemas.microsoft.com/office/drawing/2016/ink" xmlns:am3d="http://schemas.microsoft.com/office/drawing/2017/model3d" xmlns:o="urn:schemas-microsoft-com:office:office" xmlns:r="http://schemas.openxmlformats.org/officeDocument/2006/relationships" xmlns:m="http://schemas.openxmlformats.org/officeDocument/2006/math" xmlns:v="urn:schemas-microsoft-com:vml" xmlns:wp14="http://schemas.microsoft.com/office/word/2010/wordprocessingDrawing" xmlns:wp="http://schemas.openxmlformats.org/drawingml/2006/wordprocessingDrawing" xmlns:w10="urn:schemas-microsoft-com:office:word" xmlns:w="http://schemas.openxmlformats.org/wordprocessingml/2006/main" xmlns:w14="http://schemas.microsoft.com/office/word/2010/wordml" xmlns:w15="http://schemas.microsoft.com/office/word/2012/wordml" xmlns:w16cid="http://schemas.microsoft.com/office/word/2016/wordml/cid" xmlns:w16se="http://schemas.microsoft.com/office/word/2015/wordml/symex" xmlns:wpg="http://schemas.microsoft.com/office/word/2010/wordprocessingGroup" xmlns:wpi="http://schemas.microsoft.com/office/word/2010/wordprocessingInk" xmlns:wne="http://schemas.microsoft.com/office/word/2006/wordml" xmlns:wps="http://schemas.microsoft.com/office/word/2010/wordprocessingShape" mc:Ignorable="w14 w15 w16se w16cid wp14">
+<w:numbering xmlns:wpc="http://schemas.microsoft.com/office/word/2010/wordprocessingCanvas" xmlns:cx="http://schemas.microsoft.com/office/drawing/2014/chartex" xmlns:cx1="http://schemas.microsoft.com/office/drawing/2015/9/8/chartex" xmlns:cx2="http://schemas.microsoft.com/office/drawing/2015/10/21/chartex" xmlns:cx3="http://schemas.microsoft.com/office/drawing/2016/5/9/chartex" xmlns:cx4="http://schemas.microsoft.com/office/drawing/2016/5/10/chartex" xmlns:cx5="http://schemas.microsoft.com/office/drawing/2016/5/11/chartex" xmlns:cx6="http://schemas.microsoft.com/office/drawing/2016/5/12/chartex" xmlns:cx7="http://schemas.microsoft.com/office/drawing/2016/5/13/chartex" xmlns:cx8="http://schemas.microsoft.com/office/drawing/2016/5/14/chartex" xmlns:mc="http://schemas.openxmlformats.org/markup-compatibility/2006" xmlns:aink="http://schemas.microsoft.com/office/drawing/2016/ink" xmlns:am3d="http://schemas.microsoft.com/office/drawing/2017/model3d" xmlns:o="urn:schemas-microsoft-com:office:office" xmlns:r="http://schemas.openxmlformats.org/officeDocument/2006/relationships" xmlns:m="http://schemas.openxmlformats.org/officeDocument/2006/math" xmlns:v="urn:schemas-microsoft-com:vml" xmlns:wp14="http://schemas.microsoft.com/office/word/2010/wordprocessingDrawing" xmlns:wp="http://schemas.openxmlformats.org/drawingml/2006/wordprocessingDrawing" xmlns:w10="urn:schemas-microsoft-com:office:word" xmlns:w="http://schemas.openxmlformats.org/wordprocessingml/2006/main" xmlns:w14="http://schemas.microsoft.com/office/word/2010/wordml" xmlns:w15="http://schemas.microsoft.com/office/word/2012/wordml" xmlns:w16cex="http://schemas.microsoft.com/office/word/2018/wordml/cex" xmlns:w16cid="http://schemas.microsoft.com/office/word/2016/wordml/cid" xmlns:w16="http://schemas.microsoft.com/office/word/2018/wordml" xmlns:w16se="http://schemas.microsoft.com/office/word/2015/wordml/symex" xmlns:wpg="http://schemas.microsoft.com/office/word/2010/wordprocessingGroup" xmlns:wpi="http://schemas.microsoft.com/office/word/2010/wordprocessingInk" xmlns:wne="http://schemas.microsoft.com/office/word/2006/wordml" xmlns:wps="http://schemas.microsoft.com/office/word/2010/wordprocessingShape" mc:Ignorable="w14 w15 w16se w16cid w16 w16cex wp14">
   <w:abstractNum w:abstractNumId="0" w15:restartNumberingAfterBreak="0">
     <w:nsid w:val="01291F70"/>
     <w:multiLevelType w:val="hybridMultilevel"/>
@@ -6210,7 +5184,7 @@
 </file>
 
 <file path=word/styles.xml><?xml version="1.0" encoding="utf-8"?>
-<w:styles xmlns:mc="http://schemas.openxmlformats.org/markup-compatibility/2006" xmlns:r="http://schemas.openxmlformats.org/officeDocument/2006/relationships" xmlns:w="http://schemas.openxmlformats.org/wordprocessingml/2006/main" xmlns:w14="http://schemas.microsoft.com/office/word/2010/wordml" xmlns:w15="http://schemas.microsoft.com/office/word/2012/wordml" xmlns:w16cid="http://schemas.microsoft.com/office/word/2016/wordml/cid" xmlns:w16se="http://schemas.microsoft.com/office/word/2015/wordml/symex" mc:Ignorable="w14 w15 w16se w16cid">
+<w:styles xmlns:mc="http://schemas.openxmlformats.org/markup-compatibility/2006" xmlns:r="http://schemas.openxmlformats.org/officeDocument/2006/relationships" xmlns:w="http://schemas.openxmlformats.org/wordprocessingml/2006/main" xmlns:w14="http://schemas.microsoft.com/office/word/2010/wordml" xmlns:w15="http://schemas.microsoft.com/office/word/2012/wordml" xmlns:w16cex="http://schemas.microsoft.com/office/word/2018/wordml/cex" xmlns:w16cid="http://schemas.microsoft.com/office/word/2016/wordml/cid" xmlns:w16="http://schemas.microsoft.com/office/word/2018/wordml" xmlns:w16se="http://schemas.microsoft.com/office/word/2015/wordml/symex" mc:Ignorable="w14 w15 w16se w16cid w16 w16cex">
   <w:docDefaults>
     <w:rPrDefault>
       <w:rPr>
@@ -6220,7 +5194,7 @@
     </w:rPrDefault>
     <w:pPrDefault/>
   </w:docDefaults>
-  <w:latentStyles w:defLockedState="0" w:defUIPriority="99" w:defSemiHidden="0" w:defUnhideWhenUsed="0" w:defQFormat="0" w:count="375">
+  <w:latentStyles w:defLockedState="0" w:defUIPriority="99" w:defSemiHidden="0" w:defUnhideWhenUsed="0" w:defQFormat="0" w:count="376">
     <w:lsdException w:name="Normal" w:uiPriority="0" w:qFormat="1"/>
     <w:lsdException w:name="heading 1" w:uiPriority="9" w:qFormat="1"/>
     <w:lsdException w:name="heading 2" w:uiPriority="9" w:qFormat="1"/>
@@ -6596,6 +5570,7 @@
     <w:lsdException w:name="Smart Hyperlink" w:semiHidden="1" w:unhideWhenUsed="1"/>
     <w:lsdException w:name="Hashtag" w:semiHidden="1" w:unhideWhenUsed="1"/>
     <w:lsdException w:name="Unresolved Mention" w:semiHidden="1" w:unhideWhenUsed="1"/>
+    <w:lsdException w:name="Smart Link" w:semiHidden="1" w:unhideWhenUsed="1"/>
   </w:latentStyles>
   <w:style w:type="paragraph" w:default="1" w:styleId="Normal">
     <w:name w:val="Normal"/>

</xml_diff>

<commit_message>
image refinements esp figure 3
</commit_message>
<xml_diff>
--- a/JetLagPro_Research_Paper.docx
+++ b/JetLagPro_Research_Paper.docx
@@ -1,6 +1,6 @@
 
 <file path=word/document.xml><?xml version="1.0" encoding="utf-8"?>
-<w:document xmlns:wpc="http://schemas.microsoft.com/office/word/2010/wordprocessingCanvas" xmlns:cx="http://schemas.microsoft.com/office/drawing/2014/chartex" xmlns:cx1="http://schemas.microsoft.com/office/drawing/2015/9/8/chartex" xmlns:cx2="http://schemas.microsoft.com/office/drawing/2015/10/21/chartex" xmlns:cx3="http://schemas.microsoft.com/office/drawing/2016/5/9/chartex" xmlns:cx4="http://schemas.microsoft.com/office/drawing/2016/5/10/chartex" xmlns:cx5="http://schemas.microsoft.com/office/drawing/2016/5/11/chartex" xmlns:cx6="http://schemas.microsoft.com/office/drawing/2016/5/12/chartex" xmlns:cx7="http://schemas.microsoft.com/office/drawing/2016/5/13/chartex" xmlns:cx8="http://schemas.microsoft.com/office/drawing/2016/5/14/chartex" xmlns:mc="http://schemas.openxmlformats.org/markup-compatibility/2006" xmlns:aink="http://schemas.microsoft.com/office/drawing/2016/ink" xmlns:am3d="http://schemas.microsoft.com/office/drawing/2017/model3d" xmlns:o="urn:schemas-microsoft-com:office:office" xmlns:r="http://schemas.openxmlformats.org/officeDocument/2006/relationships" xmlns:m="http://schemas.openxmlformats.org/officeDocument/2006/math" xmlns:v="urn:schemas-microsoft-com:vml" xmlns:wp14="http://schemas.microsoft.com/office/word/2010/wordprocessingDrawing" xmlns:wp="http://schemas.openxmlformats.org/drawingml/2006/wordprocessingDrawing" xmlns:w10="urn:schemas-microsoft-com:office:word" xmlns:w="http://schemas.openxmlformats.org/wordprocessingml/2006/main" xmlns:w14="http://schemas.microsoft.com/office/word/2010/wordml" xmlns:w15="http://schemas.microsoft.com/office/word/2012/wordml" xmlns:w16cex="http://schemas.microsoft.com/office/word/2018/wordml/cex" xmlns:w16cid="http://schemas.microsoft.com/office/word/2016/wordml/cid" xmlns:w16="http://schemas.microsoft.com/office/word/2018/wordml" xmlns:w16se="http://schemas.microsoft.com/office/word/2015/wordml/symex" xmlns:wpg="http://schemas.microsoft.com/office/word/2010/wordprocessingGroup" xmlns:wpi="http://schemas.microsoft.com/office/word/2010/wordprocessingInk" xmlns:wne="http://schemas.microsoft.com/office/word/2006/wordml" xmlns:wps="http://schemas.microsoft.com/office/word/2010/wordprocessingShape" mc:Ignorable="w14 w15 w16se w16cid w16 w16cex wp14">
+<w:document xmlns:wpc="http://schemas.microsoft.com/office/word/2010/wordprocessingCanvas" xmlns:cx="http://schemas.microsoft.com/office/drawing/2014/chartex" xmlns:cx1="http://schemas.microsoft.com/office/drawing/2015/9/8/chartex" xmlns:cx2="http://schemas.microsoft.com/office/drawing/2015/10/21/chartex" xmlns:cx3="http://schemas.microsoft.com/office/drawing/2016/5/9/chartex" xmlns:cx4="http://schemas.microsoft.com/office/drawing/2016/5/10/chartex" xmlns:cx5="http://schemas.microsoft.com/office/drawing/2016/5/11/chartex" xmlns:cx6="http://schemas.microsoft.com/office/drawing/2016/5/12/chartex" xmlns:cx7="http://schemas.microsoft.com/office/drawing/2016/5/13/chartex" xmlns:cx8="http://schemas.microsoft.com/office/drawing/2016/5/14/chartex" xmlns:mc="http://schemas.openxmlformats.org/markup-compatibility/2006" xmlns:aink="http://schemas.microsoft.com/office/drawing/2016/ink" xmlns:am3d="http://schemas.microsoft.com/office/drawing/2017/model3d" xmlns:o="urn:schemas-microsoft-com:office:office" xmlns:r="http://schemas.openxmlformats.org/officeDocument/2006/relationships" xmlns:m="http://schemas.openxmlformats.org/officeDocument/2006/math" xmlns:v="urn:schemas-microsoft-com:vml" xmlns:wp14="http://schemas.microsoft.com/office/word/2010/wordprocessingDrawing" xmlns:wp="http://schemas.openxmlformats.org/drawingml/2006/wordprocessingDrawing" xmlns:w10="urn:schemas-microsoft-com:office:word" xmlns:w="http://schemas.openxmlformats.org/wordprocessingml/2006/main" xmlns:w14="http://schemas.microsoft.com/office/word/2010/wordml" xmlns:w15="http://schemas.microsoft.com/office/word/2012/wordml" xmlns:w16cid="http://schemas.microsoft.com/office/word/2016/wordml/cid" xmlns:w16se="http://schemas.microsoft.com/office/word/2015/wordml/symex" xmlns:wpg="http://schemas.microsoft.com/office/word/2010/wordprocessingGroup" xmlns:wpi="http://schemas.microsoft.com/office/word/2010/wordprocessingInk" xmlns:wne="http://schemas.microsoft.com/office/word/2006/wordml" xmlns:wps="http://schemas.microsoft.com/office/word/2010/wordprocessingShape" mc:Ignorable="w14 w15 w16se w16cid wp14">
   <w:body>
     <w:p>
       <w:pPr>
@@ -3066,7 +3066,6 @@
     </w:p>
     <w:p>
       <w:pPr>
-        <w:jc w:val="center"/>
         <w:divId w:val="1808039875"/>
       </w:pPr>
       <w:r>
@@ -3074,10 +3073,10 @@
           <w:noProof/>
         </w:rPr>
         <w:drawing>
-          <wp:inline distT="0" distB="0" distL="0" distR="0" wp14:anchorId="3E2252DA" wp14:editId="0855ABE5">
-            <wp:extent cx="5724525" cy="2233543"/>
-            <wp:effectExtent l="0" t="0" r="0" b="0"/>
-            <wp:docPr id="31" name="Picture 31"/>
+          <wp:inline distT="0" distB="0" distL="0" distR="0" wp14:anchorId="3648560A" wp14:editId="559574D5">
+            <wp:extent cx="5943600" cy="2319020"/>
+            <wp:effectExtent l="0" t="0" r="0" b="5080"/>
+            <wp:docPr id="27" name="Picture 27"/>
             <wp:cNvGraphicFramePr>
               <a:graphicFrameLocks xmlns:a="http://schemas.openxmlformats.org/drawingml/2006/main" noChangeAspect="1"/>
             </wp:cNvGraphicFramePr>
@@ -3085,7 +3084,7 @@
               <a:graphicData uri="http://schemas.openxmlformats.org/drawingml/2006/picture">
                 <pic:pic xmlns:pic="http://schemas.openxmlformats.org/drawingml/2006/picture">
                   <pic:nvPicPr>
-                    <pic:cNvPr id="31" name="Picture 31"/>
+                    <pic:cNvPr id="27" name="Figure 3.png"/>
                     <pic:cNvPicPr/>
                   </pic:nvPicPr>
                   <pic:blipFill>
@@ -3103,7 +3102,7 @@
                   <pic:spPr>
                     <a:xfrm>
                       <a:off x="0" y="0"/>
-                      <a:ext cx="5734740" cy="2237528"/>
+                      <a:ext cx="5943600" cy="2319020"/>
                     </a:xfrm>
                     <a:prstGeom prst="rect">
                       <a:avLst/>
@@ -3121,19 +3120,31 @@
         <w:jc w:val="center"/>
         <w:divId w:val="1808039875"/>
       </w:pPr>
-      <w:r>
-        <w:t>Figure 3 – Point Images</w:t>
-      </w:r>
     </w:p>
     <w:p>
       <w:pPr>
+        <w:jc w:val="center"/>
         <w:divId w:val="1808039875"/>
       </w:pPr>
+      <w:r>
+        <w:t>Figure 3 – Point Images</w:t>
+      </w:r>
     </w:p>
     <w:p>
       <w:pPr>
+        <w:jc w:val="center"/>
         <w:divId w:val="1808039875"/>
       </w:pPr>
+    </w:p>
+    <w:p>
+      <w:pPr>
+        <w:divId w:val="1808039875"/>
+      </w:pPr>
+    </w:p>
+    <w:p>
+      <w:pPr>
+        <w:divId w:val="1808039875"/>
+      </w:pPr>
       <w:r>
         <w:t xml:space="preserve">After the trip ends, the app </w:t>
       </w:r>
@@ -3177,7 +3188,15 @@
         <w:t>Then</w:t>
       </w:r>
       <w:r>
-        <w:t xml:space="preserve"> a survey reminder </w:t>
+        <w:t xml:space="preserve"> a survey reminde</w:t>
+      </w:r>
+      <w:bookmarkStart w:id="0" w:name="_GoBack"/>
+      <w:r>
+        <w:t>r</w:t>
+      </w:r>
+      <w:bookmarkEnd w:id="0"/>
+      <w:r>
+        <w:t xml:space="preserve"> </w:t>
       </w:r>
       <w:r>
         <w:t>is the schedul</w:t>
@@ -3837,7 +3856,7 @@
 </file>
 
 <file path=word/numbering.xml><?xml version="1.0" encoding="utf-8"?>
-<w:numbering xmlns:wpc="http://schemas.microsoft.com/office/word/2010/wordprocessingCanvas" xmlns:cx="http://schemas.microsoft.com/office/drawing/2014/chartex" xmlns:cx1="http://schemas.microsoft.com/office/drawing/2015/9/8/chartex" xmlns:cx2="http://schemas.microsoft.com/office/drawing/2015/10/21/chartex" xmlns:cx3="http://schemas.microsoft.com/office/drawing/2016/5/9/chartex" xmlns:cx4="http://schemas.microsoft.com/office/drawing/2016/5/10/chartex" xmlns:cx5="http://schemas.microsoft.com/office/drawing/2016/5/11/chartex" xmlns:cx6="http://schemas.microsoft.com/office/drawing/2016/5/12/chartex" xmlns:cx7="http://schemas.microsoft.com/office/drawing/2016/5/13/chartex" xmlns:cx8="http://schemas.microsoft.com/office/drawing/2016/5/14/chartex" xmlns:mc="http://schemas.openxmlformats.org/markup-compatibility/2006" xmlns:aink="http://schemas.microsoft.com/office/drawing/2016/ink" xmlns:am3d="http://schemas.microsoft.com/office/drawing/2017/model3d" xmlns:o="urn:schemas-microsoft-com:office:office" xmlns:r="http://schemas.openxmlformats.org/officeDocument/2006/relationships" xmlns:m="http://schemas.openxmlformats.org/officeDocument/2006/math" xmlns:v="urn:schemas-microsoft-com:vml" xmlns:wp14="http://schemas.microsoft.com/office/word/2010/wordprocessingDrawing" xmlns:wp="http://schemas.openxmlformats.org/drawingml/2006/wordprocessingDrawing" xmlns:w10="urn:schemas-microsoft-com:office:word" xmlns:w="http://schemas.openxmlformats.org/wordprocessingml/2006/main" xmlns:w14="http://schemas.microsoft.com/office/word/2010/wordml" xmlns:w15="http://schemas.microsoft.com/office/word/2012/wordml" xmlns:w16cex="http://schemas.microsoft.com/office/word/2018/wordml/cex" xmlns:w16cid="http://schemas.microsoft.com/office/word/2016/wordml/cid" xmlns:w16="http://schemas.microsoft.com/office/word/2018/wordml" xmlns:w16se="http://schemas.microsoft.com/office/word/2015/wordml/symex" xmlns:wpg="http://schemas.microsoft.com/office/word/2010/wordprocessingGroup" xmlns:wpi="http://schemas.microsoft.com/office/word/2010/wordprocessingInk" xmlns:wne="http://schemas.microsoft.com/office/word/2006/wordml" xmlns:wps="http://schemas.microsoft.com/office/word/2010/wordprocessingShape" mc:Ignorable="w14 w15 w16se w16cid w16 w16cex wp14">
+<w:numbering xmlns:wpc="http://schemas.microsoft.com/office/word/2010/wordprocessingCanvas" xmlns:cx="http://schemas.microsoft.com/office/drawing/2014/chartex" xmlns:cx1="http://schemas.microsoft.com/office/drawing/2015/9/8/chartex" xmlns:cx2="http://schemas.microsoft.com/office/drawing/2015/10/21/chartex" xmlns:cx3="http://schemas.microsoft.com/office/drawing/2016/5/9/chartex" xmlns:cx4="http://schemas.microsoft.com/office/drawing/2016/5/10/chartex" xmlns:cx5="http://schemas.microsoft.com/office/drawing/2016/5/11/chartex" xmlns:cx6="http://schemas.microsoft.com/office/drawing/2016/5/12/chartex" xmlns:cx7="http://schemas.microsoft.com/office/drawing/2016/5/13/chartex" xmlns:cx8="http://schemas.microsoft.com/office/drawing/2016/5/14/chartex" xmlns:mc="http://schemas.openxmlformats.org/markup-compatibility/2006" xmlns:aink="http://schemas.microsoft.com/office/drawing/2016/ink" xmlns:am3d="http://schemas.microsoft.com/office/drawing/2017/model3d" xmlns:o="urn:schemas-microsoft-com:office:office" xmlns:r="http://schemas.openxmlformats.org/officeDocument/2006/relationships" xmlns:m="http://schemas.openxmlformats.org/officeDocument/2006/math" xmlns:v="urn:schemas-microsoft-com:vml" xmlns:wp14="http://schemas.microsoft.com/office/word/2010/wordprocessingDrawing" xmlns:wp="http://schemas.openxmlformats.org/drawingml/2006/wordprocessingDrawing" xmlns:w10="urn:schemas-microsoft-com:office:word" xmlns:w="http://schemas.openxmlformats.org/wordprocessingml/2006/main" xmlns:w14="http://schemas.microsoft.com/office/word/2010/wordml" xmlns:w15="http://schemas.microsoft.com/office/word/2012/wordml" xmlns:w16cid="http://schemas.microsoft.com/office/word/2016/wordml/cid" xmlns:w16se="http://schemas.microsoft.com/office/word/2015/wordml/symex" xmlns:wpg="http://schemas.microsoft.com/office/word/2010/wordprocessingGroup" xmlns:wpi="http://schemas.microsoft.com/office/word/2010/wordprocessingInk" xmlns:wne="http://schemas.microsoft.com/office/word/2006/wordml" xmlns:wps="http://schemas.microsoft.com/office/word/2010/wordprocessingShape" mc:Ignorable="w14 w15 w16se w16cid wp14">
   <w:abstractNum w:abstractNumId="0" w15:restartNumberingAfterBreak="0">
     <w:nsid w:val="01291F70"/>
     <w:multiLevelType w:val="hybridMultilevel"/>
@@ -5184,7 +5203,7 @@
 </file>
 
 <file path=word/styles.xml><?xml version="1.0" encoding="utf-8"?>
-<w:styles xmlns:mc="http://schemas.openxmlformats.org/markup-compatibility/2006" xmlns:r="http://schemas.openxmlformats.org/officeDocument/2006/relationships" xmlns:w="http://schemas.openxmlformats.org/wordprocessingml/2006/main" xmlns:w14="http://schemas.microsoft.com/office/word/2010/wordml" xmlns:w15="http://schemas.microsoft.com/office/word/2012/wordml" xmlns:w16cex="http://schemas.microsoft.com/office/word/2018/wordml/cex" xmlns:w16cid="http://schemas.microsoft.com/office/word/2016/wordml/cid" xmlns:w16="http://schemas.microsoft.com/office/word/2018/wordml" xmlns:w16se="http://schemas.microsoft.com/office/word/2015/wordml/symex" mc:Ignorable="w14 w15 w16se w16cid w16 w16cex">
+<w:styles xmlns:mc="http://schemas.openxmlformats.org/markup-compatibility/2006" xmlns:r="http://schemas.openxmlformats.org/officeDocument/2006/relationships" xmlns:w="http://schemas.openxmlformats.org/wordprocessingml/2006/main" xmlns:w14="http://schemas.microsoft.com/office/word/2010/wordml" xmlns:w15="http://schemas.microsoft.com/office/word/2012/wordml" xmlns:w16cid="http://schemas.microsoft.com/office/word/2016/wordml/cid" xmlns:w16se="http://schemas.microsoft.com/office/word/2015/wordml/symex" mc:Ignorable="w14 w15 w16se w16cid">
   <w:docDefaults>
     <w:rPrDefault>
       <w:rPr>
@@ -5194,7 +5213,7 @@
     </w:rPrDefault>
     <w:pPrDefault/>
   </w:docDefaults>
-  <w:latentStyles w:defLockedState="0" w:defUIPriority="99" w:defSemiHidden="0" w:defUnhideWhenUsed="0" w:defQFormat="0" w:count="376">
+  <w:latentStyles w:defLockedState="0" w:defUIPriority="99" w:defSemiHidden="0" w:defUnhideWhenUsed="0" w:defQFormat="0" w:count="375">
     <w:lsdException w:name="Normal" w:uiPriority="0" w:qFormat="1"/>
     <w:lsdException w:name="heading 1" w:uiPriority="9" w:qFormat="1"/>
     <w:lsdException w:name="heading 2" w:uiPriority="9" w:qFormat="1"/>
@@ -5570,7 +5589,6 @@
     <w:lsdException w:name="Smart Hyperlink" w:semiHidden="1" w:unhideWhenUsed="1"/>
     <w:lsdException w:name="Hashtag" w:semiHidden="1" w:unhideWhenUsed="1"/>
     <w:lsdException w:name="Unresolved Mention" w:semiHidden="1" w:unhideWhenUsed="1"/>
-    <w:lsdException w:name="Smart Link" w:semiHidden="1" w:unhideWhenUsed="1"/>
   </w:latentStyles>
   <w:style w:type="paragraph" w:default="1" w:styleId="Normal">
     <w:name w:val="Normal"/>
@@ -6275,7 +6293,7 @@
 </file>
 
 <file path=customXml/itemProps1.xml><?xml version="1.0" encoding="utf-8"?>
-<ds:datastoreItem xmlns:ds="http://schemas.openxmlformats.org/officeDocument/2006/customXml" ds:itemID="{200A335D-E29A-4DB3-9A9E-807FF2F5FDB6}">
+<ds:datastoreItem xmlns:ds="http://schemas.openxmlformats.org/officeDocument/2006/customXml" ds:itemID="{9576F0C7-627B-420C-8FC3-CBBC76ED2089}">
   <ds:schemaRefs>
     <ds:schemaRef ds:uri="http://schemas.openxmlformats.org/officeDocument/2006/bibliography"/>
   </ds:schemaRefs>

</xml_diff>